<commit_message>
test(corpus): check the symbol font's search fields and table order; two more symbol cases
test_symbol_font.py checks the binary-search fields of the table directory
and of the character map, the order of the tables and the subtable's
length, and no longer passes over OS/2's fsSelection. E-symbol-font gets
the Latin-1 codes typed U+F000 above them and codes of the symbol range the
font does not map. The notices, the script's docstring and CLAUDE.md say
that the head table's checksum differs too, and who reads tests/fonts-word.
</commit_message>
<xml_diff>
--- a/tests/corpus/word-rules/E-symbol-font.docx
+++ b/tests/corpus/word-rules/E-symbol-font.docx
@@ -289,6 +289,38 @@
       </w:r>
     </w:p>
     <w:p>
+      <w:r>
+        <w:rPr>
+          <w:rFonts w:ascii="Liberation Sans" w:hAnsi="Liberation Sans" w:eastAsia="Liberation Sans" w:cs="Liberation Sans"/>
+        </w:rPr>
+        <w:t xml:space="preserve">Case 18: the codes U+F0C4, U+F0E9, U+F0DF and U+F0B7, case 06's characters U+F000 above them, in the symbol font: </w:t>
+      </w:r>
+      <w:r>
+        <w:rPr>
+          <w:rFonts w:ascii="Officewright Test Symbol" w:hAnsi="Officewright Test Symbol" w:eastAsia="Officewright Test Symbol" w:cs="Officewright Test Symbol"/>
+          <w:sz w:val="22"/>
+          <w:szCs w:val="22"/>
+        </w:rPr>
+        <w:t xml:space="preserve"></w:t>
+      </w:r>
+    </w:p>
+    <w:p>
+      <w:r>
+        <w:rPr>
+          <w:rFonts w:ascii="Liberation Sans" w:hAnsi="Liberation Sans" w:eastAsia="Liberation Sans" w:cs="Liberation Sans"/>
+        </w:rPr>
+        <w:t xml:space="preserve">Case 19: the codes U+F07F, U+F080 and U+F09F, inside the symbol range but not mapped by the font, in the symbol font: </w:t>
+      </w:r>
+      <w:r>
+        <w:rPr>
+          <w:rFonts w:ascii="Officewright Test Symbol" w:hAnsi="Officewright Test Symbol" w:eastAsia="Officewright Test Symbol" w:cs="Officewright Test Symbol"/>
+          <w:sz w:val="22"/>
+          <w:szCs w:val="22"/>
+        </w:rPr>
+        <w:t xml:space="preserve"></w:t>
+      </w:r>
+    </w:p>
+    <w:p>
       <w:pPr>
         <w:numPr>
           <w:ilvl w:val="0"/>
@@ -299,7 +331,7 @@
         <w:rPr>
           <w:rFonts w:ascii="Liberation Sans" w:hAnsi="Liberation Sans" w:eastAsia="Liberation Sans" w:cs="Liberation Sans"/>
         </w:rPr>
-        <w:t xml:space="preserve">Case 18: a list item whose bullet is the code U+F0B7 in the symbol font</w:t>
+        <w:t xml:space="preserve">Case 20: a list item whose bullet is the code U+F0B7 in the symbol font</w:t>
       </w:r>
     </w:p>
     <w:p>
@@ -313,15 +345,15 @@
         <w:rPr>
           <w:rFonts w:ascii="Liberation Sans" w:hAnsi="Liberation Sans" w:eastAsia="Liberation Sans" w:cs="Liberation Sans"/>
         </w:rPr>
-        <w:t xml:space="preserve">Case 19: a list item whose bullet is U+00B7 in the symbol font</w:t>
-      </w:r>
-    </w:p>
-    <w:p>
-      <w:r>
-        <w:rPr>
-          <w:rFonts w:ascii="Liberation Sans" w:hAnsi="Liberation Sans" w:eastAsia="Liberation Sans" w:cs="Liberation Sans"/>
-        </w:rPr>
-        <w:t xml:space="preserve">Case 20: five lines in the symbol font at 11 pt, shaded:</w:t>
+        <w:t xml:space="preserve">Case 21: a list item whose bullet is U+00B7 in the symbol font</w:t>
+      </w:r>
+    </w:p>
+    <w:p>
+      <w:r>
+        <w:rPr>
+          <w:rFonts w:ascii="Liberation Sans" w:hAnsi="Liberation Sans" w:eastAsia="Liberation Sans" w:cs="Liberation Sans"/>
+        </w:rPr>
+        <w:t xml:space="preserve">Case 22: five lines in the symbol font at 11 pt, shaded:</w:t>
       </w:r>
     </w:p>
     <w:p>
@@ -350,7 +382,7 @@
         <w:rPr>
           <w:rFonts w:ascii="Liberation Sans" w:hAnsi="Liberation Sans" w:eastAsia="Liberation Sans" w:cs="Liberation Sans"/>
         </w:rPr>
-        <w:t xml:space="preserve">Case 21: five lines in the symbol font at 20 pt, shaded:</w:t>
+        <w:t xml:space="preserve">Case 23: five lines in the symbol font at 20 pt, shaded:</w:t>
       </w:r>
     </w:p>
     <w:p>

</xml_diff>

<commit_message>
test(corpus): check every symbol case against its label; a wrapping case and the charset
The test of E-symbol-font checks case 07's characters, the fonts of case
15's runs and the font of case 17's w:sym; case 24 is a justified
paragraph in the symbol font that wraps, and the font table gives the
symbol font the symbol character set, as Word writes it for Symbol. The
notices say who reads tests/fonts-word, CLAUDE.md that its fonts are
installed for Word's renders, and check-test-fonts.sh's last line that the
symbol font is checked against what make-symbol-font.py writes.
</commit_message>
<xml_diff>
--- a/tests/corpus/word-rules/E-symbol-font.docx
+++ b/tests/corpus/word-rules/E-symbol-font.docx
@@ -404,6 +404,27 @@
         <w:t xml:space="preserve">20 pt line 4: Hamburgefonts gjpqy</w:t>
         <w:br/>
         <w:t xml:space="preserve">20 pt line 5: Hamburgefonts gjpqy</w:t>
+      </w:r>
+    </w:p>
+    <w:p>
+      <w:r>
+        <w:rPr>
+          <w:rFonts w:ascii="Liberation Sans" w:hAnsi="Liberation Sans" w:eastAsia="Liberation Sans" w:cs="Liberation Sans"/>
+        </w:rPr>
+        <w:t xml:space="preserve">Case 24: a justified paragraph of words in the symbol font, long enough to wrap:</w:t>
+      </w:r>
+    </w:p>
+    <w:p>
+      <w:pPr>
+        <w:jc w:val="both"/>
+      </w:pPr>
+      <w:r>
+        <w:rPr>
+          <w:rFonts w:ascii="Officewright Test Symbol" w:hAnsi="Officewright Test Symbol" w:eastAsia="Officewright Test Symbol" w:cs="Officewright Test Symbol"/>
+          <w:sz w:val="22"/>
+          <w:szCs w:val="22"/>
+        </w:rPr>
+        <w:t xml:space="preserve">Hamburgefonts gjpqy Hamburgefonts gjpqy Hamburgefonts gjpqy Hamburgefonts gjpqy Hamburgefonts gjpqy Hamburgefonts gjpqy Hamburgefonts gjpqy Hamburgefonts gjpqy Hamburgefonts gjpqy Hamburgefonts gjpqy Hamburgefonts gjpqy Hamburgefonts gjpqy</w:t>
       </w:r>
     </w:p>
     <w:sectPr>

</xml_diff>